<commit_message>
Aplica formato editorial al documento electoral de seguridad
</commit_message>
<xml_diff>
--- a/templates/seguridad_plataforma_electoral.docx
+++ b/templates/seguridad_plataforma_electoral.docx
@@ -4,7 +4,8 @@
   <w:body>
     <w:p>
       <w:pPr>
-        <w:spacing w:line="360" w:lineRule="auto"/>
+        <w:spacing w:before="5403" w:after="0" w:line="800" w:lineRule="exact"/>
+        <w:ind w:left="0" w:right="0" w:firstLine="0"/>
         <w:jc w:val="center"/>
         <w:rPr>
           <w:rFonts w:ascii="Arial" w:eastAsia="Arial" w:hAnsi="Arial" w:cs="Arial"/>
@@ -16,51 +17,99 @@
       </w:pPr>
       <w:r>
         <w:rPr>
+          <w:rFonts w:ascii="Archivo" w:hAnsi="Archivo" w:eastAsia="Archivo" w:cs="Archivo"/>
+          <w:b w:val="0"/>
+          <w:bCs/>
+          <w:sz w:val="52"/>
+          <w:szCs w:val="52"/>
+        </w:rPr>
+        <w:t>Plataforma Electoral</w:t>
+      </w:r>
+    </w:p>
+    <w:p>
+      <w:pPr>
+        <w:spacing w:before="0" w:after="0" w:line="320" w:lineRule="exact"/>
+        <w:ind w:left="0" w:right="0" w:firstLine="0"/>
+        <w:jc w:val="center"/>
+        <w:rPr>
           <w:rFonts w:ascii="Arial" w:eastAsia="Arial" w:hAnsi="Arial" w:cs="Arial"/>
           <w:b/>
           <w:bCs/>
           <w:sz w:val="24"/>
           <w:szCs w:val="24"/>
         </w:rPr>
-        <w:t>PLATAFORMA ELECTORAL</w:t>
+      </w:pPr>
+      <w:r>
+        <w:rPr>
+          <w:rFonts w:ascii="Archivo Light" w:hAnsi="Archivo Light" w:eastAsia="Archivo Light" w:cs="Archivo Light"/>
+          <w:b w:val="0"/>
+          <w:bCs/>
+          <w:sz w:val="24"/>
+          <w:szCs w:val="24"/>
+        </w:rPr>
+        <w:t>{municipio}, {estado}</w:t>
       </w:r>
     </w:p>
     <w:p>
       <w:pPr>
-        <w:spacing w:line="360" w:lineRule="auto"/>
+        <w:keepNext/>
+        <w:pageBreakBefore/>
+        <w:spacing w:before="0" w:after="0" w:line="280" w:lineRule="atLeast"/>
+        <w:ind w:left="0" w:right="0" w:firstLine="0"/>
         <w:jc w:val="center"/>
         <w:rPr>
-          <w:rFonts w:ascii="Arial" w:eastAsia="Arial" w:hAnsi="Arial" w:cs="Arial"/>
+          <w:rFonts w:ascii="Arial" w:hAnsi="Arial" w:cs="Arial"/>
           <w:b/>
           <w:bCs/>
           <w:sz w:val="24"/>
           <w:szCs w:val="24"/>
-        </w:rPr>
-      </w:pPr>
-      <w:r>
-        <w:rPr>
-          <w:rFonts w:ascii="Arial" w:eastAsia="Arial" w:hAnsi="Arial" w:cs="Arial"/>
-          <w:b/>
-          <w:bCs/>
-          <w:sz w:val="24"/>
-          <w:szCs w:val="24"/>
-        </w:rPr>
-        <w:t>{municipio}, {estado}</w:t>
+          <w:lang w:val="es-ES"/>
+        </w:rPr>
+      </w:pPr>
+      <w:r>
+        <w:rPr>
+          <w:rFonts w:ascii="Archivo Light" w:hAnsi="Archivo Light" w:eastAsia="Archivo Light" w:cs="Archivo Light"/>
+          <w:b w:val="0"/>
+          <w:bCs/>
+          <w:caps/>
+          <w:sz w:val="48"/>
+          <w:szCs w:val="48"/>
+          <w:lang w:val="es-ES"/>
+        </w:rPr>
+        <w:t>2. Seguridad</w:t>
       </w:r>
     </w:p>
     <w:p>
       <w:pPr>
-        <w:spacing w:line="360" w:lineRule="auto"/>
+        <w:spacing w:before="0" w:after="0" w:line="320" w:lineRule="exact"/>
+        <w:ind w:left="0" w:right="0" w:firstLine="0"/>
+        <w:jc w:val="both"/>
         <w:rPr>
           <w:rFonts w:ascii="Arial" w:hAnsi="Arial" w:cs="Arial"/>
           <w:b/>
           <w:bCs/>
           <w:sz w:val="24"/>
           <w:szCs w:val="24"/>
+          <w:highlight w:val="yellow"/>
           <w:lang w:val="es-ES"/>
         </w:rPr>
       </w:pPr>
       <w:r>
+        <w:rPr>
+          <w:rFonts w:ascii="Archivo Light" w:hAnsi="Archivo Light" w:eastAsia="Archivo Light" w:cs="Archivo Light"/>
+          <w:b w:val="0"/>
+          <w:sz w:val="24"/>
+          <w:szCs w:val="24"/>
+        </w:rPr>
+        <w:t>{seguridad_introduccion_electoral}</w:t>
+      </w:r>
+    </w:p>
+    <w:p>
+      <w:pPr>
+        <w:keepNext/>
+        <w:spacing w:before="0" w:after="0" w:line="280" w:lineRule="atLeast"/>
+        <w:ind w:left="0" w:right="0" w:firstLine="0"/>
+        <w:jc w:val="left"/>
         <w:rPr>
           <w:rFonts w:ascii="Arial" w:hAnsi="Arial" w:cs="Arial"/>
           <w:b/>
@@ -69,525 +118,482 @@
           <w:szCs w:val="24"/>
           <w:lang w:val="es-ES"/>
         </w:rPr>
-        <w:t>2. Seguridad</w:t>
+      </w:pPr>
+      <w:r>
+        <w:rPr>
+          <w:rFonts w:ascii="Archivo Light" w:hAnsi="Archivo Light" w:eastAsia="Archivo Light" w:cs="Archivo Light"/>
+          <w:b w:val="0"/>
+          <w:bCs/>
+          <w:sz w:val="48"/>
+          <w:szCs w:val="48"/>
+          <w:lang w:val="es-ES"/>
+        </w:rPr>
+        <w:t>a. Protección Civil</w:t>
       </w:r>
     </w:p>
     <w:p>
       <w:pPr>
-        <w:spacing w:line="360" w:lineRule="auto"/>
+        <w:spacing w:before="0" w:after="0" w:line="320" w:lineRule="exact"/>
+        <w:ind w:left="0" w:right="0" w:firstLine="0"/>
+        <w:jc w:val="both"/>
         <w:rPr>
           <w:rFonts w:ascii="Arial" w:hAnsi="Arial" w:cs="Arial"/>
           <w:b/>
           <w:bCs/>
           <w:sz w:val="24"/>
           <w:szCs w:val="24"/>
+        </w:rPr>
+      </w:pPr>
+      <w:r>
+        <w:rPr>
+          <w:rFonts w:ascii="Archivo Light" w:hAnsi="Archivo Light" w:eastAsia="Archivo Light" w:cs="Archivo Light"/>
+          <w:b w:val="0"/>
+          <w:bCs/>
+          <w:sz w:val="24"/>
+          <w:szCs w:val="24"/>
+        </w:rPr>
+        <w:t xml:space="preserve">Propuesta o plan general: </w:t>
+      </w:r>
+      <w:r>
+        <w:rPr>
+          <w:rFonts w:ascii="Archivo Light" w:hAnsi="Archivo Light" w:eastAsia="Archivo Light" w:cs="Archivo Light"/>
+          <w:b w:val="0"/>
+          <w:sz w:val="24"/>
+          <w:szCs w:val="24"/>
+        </w:rPr>
+        <w:t>{proteccion_civil_propuesta_plan_general}</w:t>
+      </w:r>
+    </w:p>
+    <w:p>
+      <w:pPr>
+        <w:spacing w:before="0" w:after="0" w:line="320" w:lineRule="exact"/>
+        <w:ind w:left="0" w:right="0" w:firstLine="283"/>
+        <w:jc w:val="both"/>
+        <w:rPr>
+          <w:rFonts w:ascii="Arial" w:hAnsi="Arial" w:cs="Arial"/>
+          <w:b/>
+          <w:bCs/>
+          <w:sz w:val="24"/>
+          <w:szCs w:val="24"/>
+        </w:rPr>
+      </w:pPr>
+      <w:r>
+        <w:rPr>
+          <w:rFonts w:ascii="Archivo Light" w:hAnsi="Archivo Light" w:eastAsia="Archivo Light" w:cs="Archivo Light"/>
+          <w:b w:val="0"/>
+          <w:bCs/>
+          <w:sz w:val="24"/>
+          <w:szCs w:val="24"/>
+        </w:rPr>
+        <w:t xml:space="preserve">Problema social a resolver: </w:t>
+      </w:r>
+      <w:r>
+        <w:rPr>
+          <w:rFonts w:ascii="Archivo Light" w:hAnsi="Archivo Light" w:eastAsia="Archivo Light" w:cs="Archivo Light"/>
+          <w:b w:val="0"/>
+          <w:sz w:val="24"/>
+          <w:szCs w:val="24"/>
+        </w:rPr>
+        <w:t>{proteccion_civil_problema_social}</w:t>
+      </w:r>
+    </w:p>
+    <w:p>
+      <w:pPr>
+        <w:spacing w:before="0" w:after="0" w:line="320" w:lineRule="exact"/>
+        <w:ind w:left="0" w:right="0" w:firstLine="283"/>
+        <w:jc w:val="both"/>
+        <w:rPr>
+          <w:rFonts w:ascii="Arial" w:hAnsi="Arial" w:cs="Arial"/>
+          <w:b/>
+          <w:bCs/>
+          <w:sz w:val="24"/>
+          <w:szCs w:val="24"/>
+        </w:rPr>
+      </w:pPr>
+      <w:r>
+        <w:rPr>
+          <w:rFonts w:ascii="Archivo Light" w:hAnsi="Archivo Light" w:eastAsia="Archivo Light" w:cs="Archivo Light"/>
+          <w:b w:val="0"/>
+          <w:bCs/>
+          <w:sz w:val="24"/>
+          <w:szCs w:val="24"/>
+        </w:rPr>
+        <w:t xml:space="preserve">Razonamiento </w:t>
+      </w:r>
+      <w:proofErr w:type="spellStart"/>
+      <w:r>
+        <w:rPr>
+          <w:rFonts w:ascii="Archivo Light" w:hAnsi="Archivo Light" w:eastAsia="Archivo Light" w:cs="Archivo Light"/>
+          <w:b w:val="0"/>
+          <w:bCs/>
+          <w:sz w:val="24"/>
+          <w:szCs w:val="24"/>
+        </w:rPr>
+        <w:t>justificatorio</w:t>
+      </w:r>
+      <w:proofErr w:type="spellEnd"/>
+      <w:r>
+        <w:rPr>
+          <w:rFonts w:ascii="Archivo Light" w:hAnsi="Archivo Light" w:eastAsia="Archivo Light" w:cs="Archivo Light"/>
+          <w:b w:val="0"/>
+          <w:bCs/>
+          <w:sz w:val="24"/>
+          <w:szCs w:val="24"/>
+        </w:rPr>
+        <w:t xml:space="preserve">: </w:t>
+      </w:r>
+      <w:r>
+        <w:rPr>
+          <w:rFonts w:ascii="Archivo Light" w:hAnsi="Archivo Light" w:eastAsia="Archivo Light" w:cs="Archivo Light"/>
+          <w:b w:val="0"/>
+          <w:sz w:val="24"/>
+          <w:szCs w:val="24"/>
+        </w:rPr>
+        <w:t>{proteccion_civil_razonamiento_justificatorio}</w:t>
+      </w:r>
+    </w:p>
+    <w:p>
+      <w:pPr>
+        <w:spacing w:before="0" w:after="0" w:line="320" w:lineRule="exact"/>
+        <w:ind w:left="0" w:right="0" w:firstLine="283"/>
+        <w:jc w:val="both"/>
+        <w:rPr>
+          <w:rFonts w:ascii="Arial" w:hAnsi="Arial" w:cs="Arial"/>
+          <w:b/>
+          <w:bCs/>
+          <w:sz w:val="24"/>
+          <w:szCs w:val="24"/>
+        </w:rPr>
+      </w:pPr>
+      <w:r>
+        <w:rPr>
+          <w:rFonts w:ascii="Archivo Light" w:hAnsi="Archivo Light" w:eastAsia="Archivo Light" w:cs="Archivo Light"/>
+          <w:b w:val="0"/>
+          <w:bCs/>
+          <w:sz w:val="24"/>
+          <w:szCs w:val="24"/>
+        </w:rPr>
+        <w:t xml:space="preserve">Propuestas específicas: </w:t>
+      </w:r>
+      <w:r>
+        <w:rPr>
+          <w:rFonts w:ascii="Archivo Light" w:hAnsi="Archivo Light" w:eastAsia="Archivo Light" w:cs="Archivo Light"/>
+          <w:b w:val="0"/>
+          <w:sz w:val="24"/>
+          <w:szCs w:val="24"/>
+        </w:rPr>
+        <w:t>{proteccion_civil_propuestas_especificas}</w:t>
+      </w:r>
+    </w:p>
+    <w:p>
+      <w:pPr>
+        <w:spacing w:before="0" w:after="0" w:line="320" w:lineRule="exact"/>
+        <w:ind w:left="0" w:right="0" w:firstLine="283"/>
+        <w:jc w:val="both"/>
+        <w:rPr>
+          <w:rFonts w:ascii="Arial" w:hAnsi="Arial" w:cs="Arial"/>
+          <w:sz w:val="24"/>
+          <w:szCs w:val="24"/>
+        </w:rPr>
+      </w:pPr>
+      <w:r>
+        <w:rPr>
+          <w:rFonts w:ascii="Archivo Light" w:hAnsi="Archivo Light" w:eastAsia="Archivo Light" w:cs="Archivo Light"/>
+          <w:b w:val="0"/>
+          <w:bCs/>
+          <w:sz w:val="24"/>
+          <w:szCs w:val="24"/>
+        </w:rPr>
+        <w:t xml:space="preserve">Línea discursiva: </w:t>
+      </w:r>
+      <w:r>
+        <w:rPr>
+          <w:rFonts w:ascii="Archivo Light" w:hAnsi="Archivo Light" w:eastAsia="Archivo Light" w:cs="Archivo Light"/>
+          <w:b w:val="0"/>
+          <w:sz w:val="24"/>
+          <w:szCs w:val="24"/>
+        </w:rPr>
+        <w:t>{proteccion_civil_linea_discursiva}</w:t>
+      </w:r>
+    </w:p>
+    <w:p>
+      <w:pPr>
+        <w:keepNext/>
+        <w:spacing w:before="0" w:after="0" w:line="280" w:lineRule="atLeast"/>
+        <w:ind w:left="0" w:right="0" w:firstLine="0"/>
+        <w:jc w:val="left"/>
+        <w:rPr>
+          <w:rFonts w:ascii="Arial" w:hAnsi="Arial" w:cs="Arial"/>
+          <w:b/>
+          <w:bCs/>
+          <w:sz w:val="24"/>
+          <w:szCs w:val="24"/>
+          <w:lang w:val="es-ES"/>
+        </w:rPr>
+      </w:pPr>
+      <w:r>
+        <w:rPr>
+          <w:rFonts w:ascii="Archivo Light" w:hAnsi="Archivo Light" w:eastAsia="Archivo Light" w:cs="Archivo Light"/>
+          <w:b w:val="0"/>
+          <w:bCs/>
+          <w:sz w:val="48"/>
+          <w:szCs w:val="48"/>
+          <w:lang w:val="es-ES"/>
+        </w:rPr>
+        <w:t>b. Seguridad</w:t>
+      </w:r>
+    </w:p>
+    <w:p>
+      <w:pPr>
+        <w:spacing w:before="0" w:after="0" w:line="320" w:lineRule="exact"/>
+        <w:ind w:left="0" w:right="0" w:firstLine="0"/>
+        <w:jc w:val="both"/>
+        <w:rPr>
+          <w:rFonts w:ascii="Arial" w:hAnsi="Arial" w:cs="Arial"/>
+          <w:b/>
+          <w:bCs/>
+          <w:sz w:val="24"/>
+          <w:szCs w:val="24"/>
+          <w:lang w:val="es-MX"/>
+        </w:rPr>
+      </w:pPr>
+      <w:r>
+        <w:rPr>
+          <w:rFonts w:ascii="Archivo Light" w:hAnsi="Archivo Light" w:eastAsia="Archivo Light" w:cs="Archivo Light"/>
+          <w:b w:val="0"/>
+          <w:bCs/>
+          <w:sz w:val="24"/>
+          <w:szCs w:val="24"/>
+        </w:rPr>
+        <w:t xml:space="preserve">Propuesta o plan general: </w:t>
+      </w:r>
+      <w:r>
+        <w:rPr>
+          <w:rFonts w:ascii="Archivo Light" w:hAnsi="Archivo Light" w:eastAsia="Archivo Light" w:cs="Archivo Light"/>
+          <w:b w:val="0"/>
+          <w:sz w:val="24"/>
+          <w:szCs w:val="24"/>
+        </w:rPr>
+        <w:t>{seguridad_propuesta_plan_general}</w:t>
+      </w:r>
+    </w:p>
+    <w:p>
+      <w:pPr>
+        <w:spacing w:before="0" w:after="0" w:line="320" w:lineRule="exact"/>
+        <w:ind w:left="0" w:right="0" w:firstLine="283"/>
+        <w:jc w:val="both"/>
+        <w:rPr>
+          <w:rFonts w:ascii="Arial" w:hAnsi="Arial" w:cs="Arial"/>
+          <w:b/>
+          <w:bCs/>
+          <w:sz w:val="24"/>
+          <w:szCs w:val="24"/>
+        </w:rPr>
+      </w:pPr>
+      <w:r>
+        <w:rPr>
+          <w:rFonts w:ascii="Archivo Light" w:hAnsi="Archivo Light" w:eastAsia="Archivo Light" w:cs="Archivo Light"/>
+          <w:b w:val="0"/>
+          <w:bCs/>
+          <w:sz w:val="24"/>
+          <w:szCs w:val="24"/>
+        </w:rPr>
+        <w:lastRenderedPageBreak/>
+        <w:t xml:space="preserve">Problema social a resolver: </w:t>
+      </w:r>
+      <w:r>
+        <w:rPr>
+          <w:rFonts w:ascii="Archivo Light" w:hAnsi="Archivo Light" w:eastAsia="Archivo Light" w:cs="Archivo Light"/>
+          <w:b w:val="0"/>
+          <w:sz w:val="24"/>
+          <w:szCs w:val="24"/>
+        </w:rPr>
+        <w:t>{seguridad_problema_social}</w:t>
+      </w:r>
+    </w:p>
+    <w:p>
+      <w:pPr>
+        <w:spacing w:before="0" w:after="0" w:line="320" w:lineRule="exact"/>
+        <w:ind w:left="0" w:right="0" w:firstLine="283"/>
+        <w:jc w:val="both"/>
+        <w:rPr>
+          <w:rFonts w:ascii="Arial" w:hAnsi="Arial" w:cs="Arial"/>
+          <w:b/>
+          <w:bCs/>
+          <w:sz w:val="24"/>
+          <w:szCs w:val="24"/>
+          <w:lang w:val="es-ES"/>
+        </w:rPr>
+      </w:pPr>
+      <w:r>
+        <w:rPr>
+          <w:rFonts w:ascii="Archivo Light" w:hAnsi="Archivo Light" w:eastAsia="Archivo Light" w:cs="Archivo Light"/>
+          <w:b w:val="0"/>
+          <w:bCs/>
+          <w:sz w:val="24"/>
+          <w:szCs w:val="24"/>
+        </w:rPr>
+        <w:t xml:space="preserve">Razonamiento </w:t>
+      </w:r>
+      <w:proofErr w:type="spellStart"/>
+      <w:r>
+        <w:rPr>
+          <w:rFonts w:ascii="Archivo Light" w:hAnsi="Archivo Light" w:eastAsia="Archivo Light" w:cs="Archivo Light"/>
+          <w:b w:val="0"/>
+          <w:bCs/>
+          <w:sz w:val="24"/>
+          <w:szCs w:val="24"/>
+        </w:rPr>
+        <w:t>justificatorio</w:t>
+      </w:r>
+      <w:proofErr w:type="spellEnd"/>
+      <w:r>
+        <w:rPr>
+          <w:rFonts w:ascii="Archivo Light" w:hAnsi="Archivo Light" w:eastAsia="Archivo Light" w:cs="Archivo Light"/>
+          <w:b w:val="0"/>
+          <w:bCs/>
+          <w:sz w:val="24"/>
+          <w:szCs w:val="24"/>
+        </w:rPr>
+        <w:t xml:space="preserve">: </w:t>
+      </w:r>
+      <w:r>
+        <w:rPr>
+          <w:rFonts w:ascii="Archivo Light" w:hAnsi="Archivo Light" w:eastAsia="Archivo Light" w:cs="Archivo Light"/>
+          <w:b w:val="0"/>
+          <w:sz w:val="24"/>
+          <w:szCs w:val="24"/>
+          <w:lang w:val="es-ES"/>
+        </w:rPr>
+        <w:t>{seguridad_razonamiento_justificatorio}</w:t>
+      </w:r>
+    </w:p>
+    <w:p>
+      <w:pPr>
+        <w:spacing w:before="0" w:after="0" w:line="320" w:lineRule="exact"/>
+        <w:ind w:left="0" w:right="0" w:firstLine="283"/>
+        <w:jc w:val="both"/>
+        <w:rPr>
+          <w:rFonts w:ascii="Arial" w:hAnsi="Arial" w:cs="Arial"/>
+          <w:b/>
+          <w:bCs/>
+          <w:sz w:val="24"/>
+          <w:szCs w:val="24"/>
+          <w:lang w:val="es-MX"/>
+        </w:rPr>
+      </w:pPr>
+      <w:r>
+        <w:rPr>
+          <w:rFonts w:ascii="Archivo Light" w:hAnsi="Archivo Light" w:eastAsia="Archivo Light" w:cs="Archivo Light"/>
+          <w:b w:val="0"/>
+          <w:bCs/>
+          <w:sz w:val="24"/>
+          <w:szCs w:val="24"/>
+        </w:rPr>
+        <w:t xml:space="preserve">Propuestas específicas: </w:t>
+      </w:r>
+      <w:r>
+        <w:rPr>
+          <w:rFonts w:ascii="Archivo Light" w:hAnsi="Archivo Light" w:eastAsia="Archivo Light" w:cs="Archivo Light"/>
+          <w:b w:val="0"/>
+          <w:sz w:val="24"/>
+          <w:szCs w:val="24"/>
+        </w:rPr>
+        <w:t>{seguridad_propuestas_especificas}</w:t>
+      </w:r>
+    </w:p>
+    <w:p>
+      <w:pPr>
+        <w:spacing w:before="0" w:after="0" w:line="320" w:lineRule="exact"/>
+        <w:ind w:left="0" w:right="0" w:firstLine="283"/>
+        <w:jc w:val="both"/>
+        <w:rPr>
+          <w:rFonts w:ascii="Arial" w:hAnsi="Arial" w:cs="Arial"/>
+          <w:b/>
+          <w:bCs/>
+          <w:sz w:val="24"/>
+          <w:szCs w:val="24"/>
+        </w:rPr>
+      </w:pPr>
+      <w:r>
+        <w:rPr>
+          <w:rFonts w:ascii="Archivo Light" w:hAnsi="Archivo Light" w:eastAsia="Archivo Light" w:cs="Archivo Light"/>
+          <w:b w:val="0"/>
+          <w:bCs/>
+          <w:sz w:val="24"/>
+          <w:szCs w:val="24"/>
+        </w:rPr>
+        <w:t xml:space="preserve">Línea discursiva: </w:t>
+      </w:r>
+      <w:r>
+        <w:rPr>
+          <w:rFonts w:ascii="Archivo Light" w:hAnsi="Archivo Light" w:eastAsia="Archivo Light" w:cs="Archivo Light"/>
+          <w:b w:val="0"/>
+          <w:sz w:val="24"/>
+          <w:szCs w:val="24"/>
+        </w:rPr>
+        <w:t>{seguridad_linea_discursiva}</w:t>
+      </w:r>
+    </w:p>
+    <w:p>
+      <w:pPr>
+        <w:keepNext/>
+        <w:spacing w:before="0" w:after="0" w:line="280" w:lineRule="atLeast"/>
+        <w:ind w:left="0" w:right="0" w:firstLine="0"/>
+        <w:jc w:val="left"/>
+        <w:rPr>
+          <w:rFonts w:ascii="Arial" w:hAnsi="Arial" w:cs="Arial"/>
+          <w:b/>
+          <w:bCs/>
+          <w:sz w:val="24"/>
+          <w:szCs w:val="24"/>
+          <w:lang w:val="es-ES"/>
+        </w:rPr>
+      </w:pPr>
+      <w:r>
+        <w:rPr>
+          <w:rFonts w:ascii="Archivo Light" w:hAnsi="Archivo Light" w:eastAsia="Archivo Light" w:cs="Archivo Light"/>
+          <w:b w:val="0"/>
+          <w:bCs/>
+          <w:sz w:val="48"/>
+          <w:szCs w:val="48"/>
+          <w:lang w:val="es-ES"/>
+        </w:rPr>
+        <w:t>Fuentes clave</w:t>
+      </w:r>
+    </w:p>
+    <w:p>
+      <w:pPr>
+        <w:spacing w:before="0" w:after="0" w:line="320" w:lineRule="exact"/>
+        <w:ind w:left="0" w:right="0" w:firstLine="0"/>
+        <w:jc w:val="left"/>
+        <w:rPr>
+          <w:rFonts w:ascii="Arial" w:hAnsi="Arial" w:cs="Arial"/>
+          <w:b/>
+          <w:bCs/>
+          <w:sz w:val="24"/>
+          <w:szCs w:val="24"/>
           <w:highlight w:val="yellow"/>
           <w:lang w:val="es-ES"/>
         </w:rPr>
       </w:pPr>
       <w:r>
         <w:rPr>
-          <w:rFonts w:ascii="Arial" w:hAnsi="Arial" w:cs="Arial"/>
-          <w:sz w:val="24"/>
-          <w:szCs w:val="24"/>
-        </w:rPr>
-        <w:t>{seguridad_introduccion_electoral}</w:t>
-      </w:r>
-    </w:p>
-    <w:p>
-      <w:pPr>
-        <w:ind w:left="1788"/>
-        <w:rPr>
-          <w:rFonts w:ascii="Arial" w:hAnsi="Arial" w:cs="Arial"/>
-          <w:b/>
-          <w:bCs/>
-          <w:sz w:val="24"/>
-          <w:szCs w:val="24"/>
-          <w:lang w:val="es-ES"/>
-        </w:rPr>
-      </w:pPr>
-      <w:r>
-        <w:rPr>
-          <w:rFonts w:ascii="Arial" w:hAnsi="Arial" w:cs="Arial"/>
-          <w:b/>
-          <w:bCs/>
-          <w:sz w:val="24"/>
-          <w:szCs w:val="24"/>
-          <w:lang w:val="es-ES"/>
-        </w:rPr>
-        <w:t>a. Protección Civil</w:t>
-      </w:r>
-    </w:p>
-    <w:p>
-      <w:pPr>
-        <w:rPr>
-          <w:rFonts w:ascii="Arial" w:hAnsi="Arial" w:cs="Arial"/>
-          <w:b/>
-          <w:bCs/>
-          <w:sz w:val="24"/>
-          <w:szCs w:val="24"/>
-        </w:rPr>
-      </w:pPr>
-    </w:p>
-    <w:p>
-      <w:pPr>
-        <w:rPr>
-          <w:rFonts w:ascii="Arial" w:hAnsi="Arial" w:cs="Arial"/>
-          <w:b/>
-          <w:bCs/>
-          <w:sz w:val="24"/>
-          <w:szCs w:val="24"/>
-        </w:rPr>
-      </w:pPr>
-      <w:r>
-        <w:rPr>
-          <w:rFonts w:ascii="Arial" w:hAnsi="Arial" w:cs="Arial"/>
-          <w:b/>
-          <w:bCs/>
-          <w:sz w:val="24"/>
-          <w:szCs w:val="24"/>
-        </w:rPr>
-        <w:t xml:space="preserve">Propuesta o plan general: </w:t>
-      </w:r>
-      <w:r>
-        <w:rPr>
-          <w:rFonts w:ascii="Arial" w:hAnsi="Arial" w:cs="Arial"/>
-          <w:sz w:val="24"/>
-          <w:szCs w:val="24"/>
-        </w:rPr>
-        <w:t>{proteccion_civil_propuesta_plan_general}</w:t>
-      </w:r>
-    </w:p>
-    <w:p>
-      <w:pPr>
-        <w:rPr>
-          <w:rFonts w:ascii="Arial" w:hAnsi="Arial" w:cs="Arial"/>
-          <w:b/>
-          <w:bCs/>
-          <w:sz w:val="24"/>
-          <w:szCs w:val="24"/>
-        </w:rPr>
-      </w:pPr>
-      <w:r>
-        <w:rPr>
-          <w:rFonts w:ascii="Arial" w:hAnsi="Arial" w:cs="Arial"/>
-          <w:b/>
-          <w:bCs/>
-          <w:sz w:val="24"/>
-          <w:szCs w:val="24"/>
-        </w:rPr>
-        <w:t xml:space="preserve">Problema social a resolver: </w:t>
-      </w:r>
-      <w:r>
-        <w:rPr>
-          <w:rFonts w:ascii="Arial" w:hAnsi="Arial" w:cs="Arial"/>
-          <w:sz w:val="24"/>
-          <w:szCs w:val="24"/>
-        </w:rPr>
-        <w:t>{proteccion_civil_problema_social}</w:t>
-      </w:r>
-    </w:p>
-    <w:p>
-      <w:pPr>
-        <w:rPr>
-          <w:rFonts w:ascii="Arial" w:hAnsi="Arial" w:cs="Arial"/>
-          <w:b/>
-          <w:bCs/>
-          <w:sz w:val="24"/>
-          <w:szCs w:val="24"/>
-        </w:rPr>
-      </w:pPr>
-      <w:r>
-        <w:rPr>
-          <w:rFonts w:ascii="Arial" w:hAnsi="Arial" w:cs="Arial"/>
-          <w:b/>
-          <w:bCs/>
-          <w:sz w:val="24"/>
-          <w:szCs w:val="24"/>
-        </w:rPr>
-        <w:t xml:space="preserve">Razonamiento </w:t>
-      </w:r>
-      <w:proofErr w:type="spellStart"/>
-      <w:r>
-        <w:rPr>
-          <w:rFonts w:ascii="Arial" w:hAnsi="Arial" w:cs="Arial"/>
-          <w:b/>
-          <w:bCs/>
-          <w:sz w:val="24"/>
-          <w:szCs w:val="24"/>
-        </w:rPr>
-        <w:t>justificatorio</w:t>
-      </w:r>
-      <w:proofErr w:type="spellEnd"/>
-      <w:r>
-        <w:rPr>
-          <w:rFonts w:ascii="Arial" w:hAnsi="Arial" w:cs="Arial"/>
-          <w:b/>
-          <w:bCs/>
-          <w:sz w:val="24"/>
-          <w:szCs w:val="24"/>
-        </w:rPr>
-        <w:t xml:space="preserve">: </w:t>
-      </w:r>
-      <w:r>
-        <w:rPr>
-          <w:rFonts w:ascii="Arial" w:hAnsi="Arial" w:cs="Arial"/>
-          <w:sz w:val="24"/>
-          <w:szCs w:val="24"/>
-        </w:rPr>
-        <w:t>{proteccion_civil_razonamiento_justificatorio}</w:t>
-      </w:r>
-    </w:p>
-    <w:p>
-      <w:pPr>
-        <w:rPr>
-          <w:rFonts w:ascii="Arial" w:hAnsi="Arial" w:cs="Arial"/>
-          <w:b/>
-          <w:bCs/>
-          <w:sz w:val="24"/>
-          <w:szCs w:val="24"/>
-        </w:rPr>
-      </w:pPr>
-      <w:r>
-        <w:rPr>
-          <w:rFonts w:ascii="Arial" w:hAnsi="Arial" w:cs="Arial"/>
-          <w:b/>
-          <w:bCs/>
-          <w:sz w:val="24"/>
-          <w:szCs w:val="24"/>
-        </w:rPr>
-        <w:t xml:space="preserve">Propuestas específicas: </w:t>
-      </w:r>
-      <w:r>
-        <w:rPr>
-          <w:rFonts w:ascii="Arial" w:hAnsi="Arial" w:cs="Arial"/>
-          <w:sz w:val="24"/>
-          <w:szCs w:val="24"/>
-        </w:rPr>
-        <w:t>{proteccion_civil_propuestas_especificas}</w:t>
-      </w:r>
-    </w:p>
-    <w:p>
-      <w:pPr>
-        <w:rPr>
-          <w:rFonts w:ascii="Arial" w:hAnsi="Arial" w:cs="Arial"/>
-          <w:sz w:val="24"/>
-          <w:szCs w:val="24"/>
-        </w:rPr>
-      </w:pPr>
-      <w:r>
-        <w:rPr>
-          <w:rFonts w:ascii="Arial" w:hAnsi="Arial" w:cs="Arial"/>
-          <w:b/>
-          <w:bCs/>
-          <w:sz w:val="24"/>
-          <w:szCs w:val="24"/>
-        </w:rPr>
-        <w:t xml:space="preserve">Línea discursiva: </w:t>
-      </w:r>
-      <w:r>
-        <w:rPr>
-          <w:rFonts w:ascii="Arial" w:hAnsi="Arial" w:cs="Arial"/>
-          <w:sz w:val="24"/>
-          <w:szCs w:val="24"/>
-        </w:rPr>
-        <w:t>{proteccion_civil_linea_discursiva}</w:t>
-      </w:r>
-    </w:p>
-    <w:p>
-      <w:pPr>
-        <w:rPr>
-          <w:rFonts w:ascii="Arial" w:hAnsi="Arial" w:cs="Arial"/>
-          <w:b/>
-          <w:bCs/>
-          <w:sz w:val="24"/>
-          <w:szCs w:val="24"/>
-          <w:highlight w:val="yellow"/>
-          <w:lang w:val="es-ES"/>
-        </w:rPr>
-      </w:pPr>
-    </w:p>
-    <w:p>
-      <w:pPr>
-        <w:ind w:left="1788"/>
-        <w:rPr>
-          <w:rFonts w:ascii="Arial" w:hAnsi="Arial" w:cs="Arial"/>
-          <w:b/>
-          <w:bCs/>
-          <w:sz w:val="24"/>
-          <w:szCs w:val="24"/>
-          <w:lang w:val="es-ES"/>
-        </w:rPr>
-      </w:pPr>
-      <w:r>
-        <w:rPr>
-          <w:rFonts w:ascii="Arial" w:hAnsi="Arial" w:cs="Arial"/>
-          <w:b/>
-          <w:bCs/>
-          <w:sz w:val="24"/>
-          <w:szCs w:val="24"/>
-          <w:lang w:val="es-ES"/>
-        </w:rPr>
-        <w:t>b. Seguridad</w:t>
-      </w:r>
-    </w:p>
-    <w:p>
-      <w:pPr>
-        <w:spacing w:line="360" w:lineRule="auto"/>
-        <w:ind w:left="348"/>
-        <w:jc w:val="both"/>
-        <w:rPr>
-          <w:rFonts w:ascii="Arial" w:hAnsi="Arial" w:cs="Arial"/>
-          <w:b/>
-          <w:bCs/>
-          <w:sz w:val="24"/>
-          <w:szCs w:val="24"/>
-        </w:rPr>
-      </w:pPr>
-    </w:p>
-    <w:p>
-      <w:pPr>
-        <w:rPr>
-          <w:rFonts w:ascii="Arial" w:hAnsi="Arial" w:cs="Arial"/>
-          <w:b/>
-          <w:bCs/>
-          <w:sz w:val="24"/>
-          <w:szCs w:val="24"/>
-          <w:lang w:val="es-MX"/>
-        </w:rPr>
-      </w:pPr>
-      <w:r>
-        <w:rPr>
-          <w:rFonts w:ascii="Arial" w:hAnsi="Arial" w:cs="Arial"/>
-          <w:b/>
-          <w:bCs/>
-          <w:sz w:val="24"/>
-          <w:szCs w:val="24"/>
-        </w:rPr>
-        <w:t xml:space="preserve">Propuesta o plan general: </w:t>
-      </w:r>
-      <w:r>
-        <w:rPr>
-          <w:rFonts w:ascii="Arial" w:hAnsi="Arial" w:cs="Arial"/>
-          <w:sz w:val="24"/>
-          <w:szCs w:val="24"/>
-        </w:rPr>
-        <w:t>{seguridad_propuesta_plan_general}</w:t>
-      </w:r>
-    </w:p>
-    <w:p>
-      <w:pPr>
-        <w:rPr>
-          <w:rFonts w:ascii="Arial" w:hAnsi="Arial" w:cs="Arial"/>
-          <w:b/>
-          <w:bCs/>
-          <w:sz w:val="24"/>
-          <w:szCs w:val="24"/>
-        </w:rPr>
-      </w:pPr>
-      <w:r>
-        <w:rPr>
-          <w:rFonts w:ascii="Arial" w:hAnsi="Arial" w:cs="Arial"/>
-          <w:b/>
-          <w:bCs/>
-          <w:sz w:val="24"/>
-          <w:szCs w:val="24"/>
-        </w:rPr>
-        <w:lastRenderedPageBreak/>
-        <w:t xml:space="preserve">Problema social a resolver: </w:t>
-      </w:r>
-      <w:r>
-        <w:rPr>
-          <w:rFonts w:ascii="Arial" w:hAnsi="Arial" w:cs="Arial"/>
-          <w:sz w:val="24"/>
-          <w:szCs w:val="24"/>
-        </w:rPr>
-        <w:t>{seguridad_problema_social}</w:t>
-      </w:r>
-    </w:p>
-    <w:p>
-      <w:pPr>
-        <w:rPr>
-          <w:rFonts w:ascii="Arial" w:hAnsi="Arial" w:cs="Arial"/>
-          <w:b/>
-          <w:bCs/>
-          <w:sz w:val="24"/>
-          <w:szCs w:val="24"/>
-          <w:lang w:val="es-ES"/>
-        </w:rPr>
-      </w:pPr>
-      <w:r>
-        <w:rPr>
-          <w:rFonts w:ascii="Arial" w:hAnsi="Arial" w:cs="Arial"/>
-          <w:b/>
-          <w:bCs/>
-          <w:sz w:val="24"/>
-          <w:szCs w:val="24"/>
-        </w:rPr>
-        <w:t xml:space="preserve">Razonamiento </w:t>
-      </w:r>
-      <w:proofErr w:type="spellStart"/>
-      <w:r>
-        <w:rPr>
-          <w:rFonts w:ascii="Arial" w:hAnsi="Arial" w:cs="Arial"/>
-          <w:b/>
-          <w:bCs/>
-          <w:sz w:val="24"/>
-          <w:szCs w:val="24"/>
-        </w:rPr>
-        <w:t>justificatorio</w:t>
-      </w:r>
-      <w:proofErr w:type="spellEnd"/>
-      <w:r>
-        <w:rPr>
-          <w:rFonts w:ascii="Arial" w:hAnsi="Arial" w:cs="Arial"/>
-          <w:b/>
-          <w:bCs/>
-          <w:sz w:val="24"/>
-          <w:szCs w:val="24"/>
-        </w:rPr>
-        <w:t xml:space="preserve">: </w:t>
-      </w:r>
-      <w:r>
-        <w:rPr>
-          <w:rFonts w:ascii="Arial" w:hAnsi="Arial" w:cs="Arial"/>
-          <w:sz w:val="24"/>
-          <w:szCs w:val="24"/>
-          <w:lang w:val="es-ES"/>
-        </w:rPr>
-        <w:t>{seguridad_razonamiento_justificatorio}</w:t>
-      </w:r>
-    </w:p>
-    <w:p>
-      <w:pPr>
-        <w:rPr>
-          <w:rFonts w:ascii="Arial" w:hAnsi="Arial" w:cs="Arial"/>
-          <w:b/>
-          <w:bCs/>
-          <w:sz w:val="24"/>
-          <w:szCs w:val="24"/>
-          <w:lang w:val="es-MX"/>
-        </w:rPr>
-      </w:pPr>
-      <w:r>
-        <w:rPr>
-          <w:rFonts w:ascii="Arial" w:hAnsi="Arial" w:cs="Arial"/>
-          <w:b/>
-          <w:bCs/>
-          <w:sz w:val="24"/>
-          <w:szCs w:val="24"/>
-        </w:rPr>
-        <w:t xml:space="preserve">Propuestas específicas: </w:t>
-      </w:r>
-      <w:r>
-        <w:rPr>
-          <w:rFonts w:ascii="Arial" w:hAnsi="Arial" w:cs="Arial"/>
-          <w:sz w:val="24"/>
-          <w:szCs w:val="24"/>
-        </w:rPr>
-        <w:t>{seguridad_propuestas_especificas}</w:t>
-      </w:r>
-    </w:p>
-    <w:p>
-      <w:pPr>
-        <w:rPr>
-          <w:rFonts w:ascii="Arial" w:hAnsi="Arial" w:cs="Arial"/>
-          <w:b/>
-          <w:bCs/>
-          <w:sz w:val="24"/>
-          <w:szCs w:val="24"/>
-        </w:rPr>
-      </w:pPr>
-      <w:r>
-        <w:rPr>
-          <w:rFonts w:ascii="Arial" w:hAnsi="Arial" w:cs="Arial"/>
-          <w:b/>
-          <w:bCs/>
-          <w:sz w:val="24"/>
-          <w:szCs w:val="24"/>
-        </w:rPr>
-        <w:t xml:space="preserve">Línea discursiva: </w:t>
-      </w:r>
-      <w:r>
-        <w:rPr>
-          <w:rFonts w:ascii="Arial" w:hAnsi="Arial" w:cs="Arial"/>
-          <w:sz w:val="24"/>
-          <w:szCs w:val="24"/>
-        </w:rPr>
-        <w:t>{seguridad_linea_discursiva}</w:t>
-      </w:r>
-    </w:p>
-    <w:p>
-      <w:pPr>
-        <w:rPr>
-          <w:rFonts w:ascii="Arial" w:hAnsi="Arial" w:cs="Arial"/>
-          <w:b/>
-          <w:bCs/>
-          <w:sz w:val="24"/>
-          <w:szCs w:val="24"/>
-          <w:lang w:val="es-ES"/>
-        </w:rPr>
-      </w:pPr>
-    </w:p>
-    <w:p>
-      <w:pPr>
-        <w:spacing w:line="360" w:lineRule="auto"/>
-        <w:rPr>
-          <w:rFonts w:ascii="Arial" w:hAnsi="Arial" w:cs="Arial"/>
-          <w:b/>
-          <w:bCs/>
-          <w:sz w:val="24"/>
-          <w:szCs w:val="24"/>
-          <w:lang w:val="es-ES"/>
-        </w:rPr>
-      </w:pPr>
-    </w:p>
-    <w:p>
-      <w:pPr>
-        <w:ind w:left="1788"/>
-        <w:rPr>
-          <w:rFonts w:ascii="Arial" w:hAnsi="Arial" w:cs="Arial"/>
-          <w:b/>
-          <w:bCs/>
-          <w:sz w:val="24"/>
-          <w:szCs w:val="24"/>
-          <w:lang w:val="es-ES"/>
-        </w:rPr>
-      </w:pPr>
-      <w:r>
-        <w:rPr>
-          <w:rFonts w:ascii="Arial" w:hAnsi="Arial" w:cs="Arial"/>
-          <w:b/>
-          <w:bCs/>
-          <w:sz w:val="24"/>
-          <w:szCs w:val="24"/>
-          <w:lang w:val="es-ES"/>
-        </w:rPr>
-        <w:t>Fuentes clave</w:t>
-      </w:r>
-    </w:p>
-    <w:p>
-      <w:pPr>
-        <w:spacing w:line="360" w:lineRule="auto"/>
-        <w:rPr>
-          <w:rFonts w:ascii="Arial" w:hAnsi="Arial" w:cs="Arial"/>
-          <w:b/>
-          <w:bCs/>
-          <w:sz w:val="24"/>
-          <w:szCs w:val="24"/>
-          <w:highlight w:val="yellow"/>
-          <w:lang w:val="es-ES"/>
-        </w:rPr>
-      </w:pPr>
-      <w:r>
+          <w:rFonts w:ascii="Archivo Light" w:hAnsi="Archivo Light" w:eastAsia="Archivo Light" w:cs="Archivo Light"/>
+          <w:b w:val="0"/>
+          <w:sz w:val="24"/>
+          <w:szCs w:val="24"/>
+        </w:rPr>
         <w:t>{fuentes_clave}</w:t>
       </w:r>
     </w:p>
     <w:sectPr>
+      <w:footerReference w:type="first" r:id="rId9"/>
       <w:pgSz w:w="12240" w:h="15840"/>
       <w:pgMar w:top="1417" w:right="1701" w:bottom="1417" w:left="1701" w:header="708" w:footer="708" w:gutter="0"/>
       <w:pgNumType w:start="1"/>
       <w:cols w:space="720"/>
+      <w:titlePg/>
     </w:sectPr>
   </w:body>
 </w:document>
@@ -616,6 +622,51 @@
     </w:p>
   </w:endnote>
 </w:endnotes>
+</file>
+
+<file path=word/footer1.xml><?xml version="1.0" encoding="utf-8"?>
+<w:ftr xmlns:m="http://schemas.openxmlformats.org/officeDocument/2006/math" xmlns:mc="http://schemas.openxmlformats.org/markup-compatibility/2006" xmlns:mo="http://schemas.microsoft.com/office/mac/office/2008/main" xmlns:mv="urn:schemas-microsoft-com:mac:vml" xmlns:o="urn:schemas-microsoft-com:office:office" xmlns:r="http://schemas.openxmlformats.org/officeDocument/2006/relationships" xmlns:v="urn:schemas-microsoft-com:vml" xmlns:w10="urn:schemas-microsoft-com:office:word" xmlns:w14="http://schemas.microsoft.com/office/word/2010/wordml" xmlns:w="http://schemas.openxmlformats.org/wordprocessingml/2006/main" xmlns:wne="http://schemas.microsoft.com/office/word/2006/wordml" xmlns:wp14="http://schemas.microsoft.com/office/word/2010/wordprocessingDrawing" xmlns:wp="http://schemas.openxmlformats.org/drawingml/2006/wordprocessingDrawing" xmlns:wpc="http://schemas.microsoft.com/office/word/2010/wordprocessingCanvas" xmlns:wpg="http://schemas.microsoft.com/office/word/2010/wordprocessingGroup" xmlns:wpi="http://schemas.microsoft.com/office/word/2010/wordprocessingInk" xmlns:wps="http://schemas.microsoft.com/office/word/2010/wordprocessingShape" mc:Ignorable="w14 wp14">
+  <w:p>
+    <w:pPr>
+      <w:pStyle w:val="Footer"/>
+      <w:jc w:val="center"/>
+    </w:pPr>
+    <w:r>
+      <w:drawing>
+        <wp:inline xmlns:a="http://schemas.openxmlformats.org/drawingml/2006/main" xmlns:pic="http://schemas.openxmlformats.org/drawingml/2006/picture">
+          <wp:extent cx="1800000" cy="1468304"/>
+          <wp:docPr id="1" name="Picture 1"/>
+          <wp:cNvGraphicFramePr>
+            <a:graphicFrameLocks noChangeAspect="1"/>
+          </wp:cNvGraphicFramePr>
+          <a:graphic>
+            <a:graphicData uri="http://schemas.openxmlformats.org/drawingml/2006/picture">
+              <pic:pic>
+                <pic:nvPicPr>
+                  <pic:cNvPr id="0" name="image.jpg"/>
+                  <pic:cNvPicPr/>
+                </pic:nvPicPr>
+                <pic:blipFill>
+                  <a:blip r:embed="rId1"/>
+                  <a:stretch>
+                    <a:fillRect/>
+                  </a:stretch>
+                </pic:blipFill>
+                <pic:spPr>
+                  <a:xfrm>
+                    <a:off x="0" y="0"/>
+                    <a:ext cx="1800000" cy="1468304"/>
+                  </a:xfrm>
+                  <a:prstGeom prst="rect"/>
+                </pic:spPr>
+              </pic:pic>
+            </a:graphicData>
+          </a:graphic>
+        </wp:inline>
+      </w:drawing>
+    </w:r>
+  </w:p>
+</w:ftr>
 </file>
 
 <file path=word/footnotes.xml><?xml version="1.0" encoding="utf-8"?>

</xml_diff>